<commit_message>
docs: update requirements manager manual
</commit_message>
<xml_diff>
--- a/apps/web/public/manuals/Matrix-Req-Manager用户使用手册.docx
+++ b/apps/web/public/manuals/Matrix-Req-Manager用户使用手册.docx
@@ -1,6 +1,6 @@
 
 <file path=word/document.xml><?xml version="1.0" encoding="utf-8"?>
-<w:document xmlns:wpc="http://schemas.microsoft.com/office/word/2010/wordprocessingCanvas" xmlns:mc="http://schemas.openxmlformats.org/markup-compatibility/2006" xmlns:o="urn:schemas-microsoft-com:office:office" xmlns:r="http://schemas.openxmlformats.org/officeDocument/2006/relationships" xmlns:m="http://schemas.openxmlformats.org/officeDocument/2006/math" xmlns:v="urn:schemas-microsoft-com:vml" xmlns:wp14="http://schemas.microsoft.com/office/word/2010/wordprocessingDrawing" xmlns:wp="http://schemas.openxmlformats.org/drawingml/2006/wordprocessingDrawing" xmlns:w="http://schemas.openxmlformats.org/wordprocessingml/2006/main" xmlns:w14="http://schemas.microsoft.com/office/word/2010/wordml" xmlns:w10="urn:schemas-microsoft-com:office:word" xmlns:w15="http://schemas.microsoft.com/office/word/2012/wordml" xmlns:wpg="http://schemas.microsoft.com/office/word/2010/wordprocessingGroup" xmlns:wpi="http://schemas.microsoft.com/office/word/2010/wordprocessingInk" xmlns:wne="http://schemas.microsoft.com/office/word/2006/wordml" xmlns:wps="http://schemas.microsoft.com/office/word/2010/wordprocessingShape" xmlns:wpsCustomData="http://www.wps.cn/officeDocument/2013/wpsCustomData" mc:Ignorable="w14 w15 wp14">
+<w:document xmlns:wpc="http://schemas.microsoft.com/office/word/2010/wordprocessingCanvas" xmlns:cx="http://schemas.microsoft.com/office/drawing/2014/chartex" xmlns:cx1="http://schemas.microsoft.com/office/drawing/2015/9/8/chartex" xmlns:cx2="http://schemas.microsoft.com/office/drawing/2015/10/21/chartex" xmlns:cx3="http://schemas.microsoft.com/office/drawing/2016/5/9/chartex" xmlns:cx4="http://schemas.microsoft.com/office/drawing/2016/5/10/chartex" xmlns:cx5="http://schemas.microsoft.com/office/drawing/2016/5/11/chartex" xmlns:cx6="http://schemas.microsoft.com/office/drawing/2016/5/12/chartex" xmlns:cx7="http://schemas.microsoft.com/office/drawing/2016/5/13/chartex" xmlns:cx8="http://schemas.microsoft.com/office/drawing/2016/5/14/chartex" xmlns:mc="http://schemas.openxmlformats.org/markup-compatibility/2006" xmlns:o="urn:schemas-microsoft-com:office:office" xmlns:r="http://schemas.openxmlformats.org/officeDocument/2006/relationships" xmlns:m="http://schemas.openxmlformats.org/officeDocument/2006/math" xmlns:v="urn:schemas-microsoft-com:vml" xmlns:wp14="http://schemas.microsoft.com/office/word/2010/wordprocessingDrawing" xmlns:wp="http://schemas.openxmlformats.org/drawingml/2006/wordprocessingDrawing" xmlns:w="http://schemas.openxmlformats.org/wordprocessingml/2006/main" xmlns:w14="http://schemas.microsoft.com/office/word/2010/wordml" xmlns:w10="urn:schemas-microsoft-com:office:word" xmlns:w15="http://schemas.microsoft.com/office/word/2012/wordml" xmlns:wpg="http://schemas.microsoft.com/office/word/2010/wordprocessingGroup" xmlns:wpi="http://schemas.microsoft.com/office/word/2010/wordprocessingInk" xmlns:wne="http://schemas.microsoft.com/office/word/2006/wordml" xmlns:wps="http://schemas.microsoft.com/office/word/2010/wordprocessingShape" xmlns:wpsCustomData="http://www.wps.cn/officeDocument/2013/wpsCustomData" mc:Ignorable="w14 w15 wp14">
   <w:body>
     <w:p>
       <w:pPr>
@@ -90,8 +90,6 @@
       <w:r>
         <w:t>使用前准备</w:t>
       </w:r>
-      <w:bookmarkStart w:id="0" w:name="_GoBack"/>
-      <w:bookmarkEnd w:id="0"/>
     </w:p>
     <w:p>
       <w:pPr>
@@ -106,7 +104,18 @@
         <w:pStyle w:val="16"/>
       </w:pPr>
       <w:r>
-        <w:t>准备仅包含 DOCX 源文档的 ZIP 压缩包，不要混入 DOC、PDF、.matrix 或其他格式。</w:t>
+        <w:t>准备仅包含 DOCX 源文档的 ZIP 压缩包，不要混入 DOC、PDF或其他格式。</w:t>
+      </w:r>
+      <w:r>
+        <w:rPr>
+          <w:rFonts w:hint="eastAsia"/>
+          <w:b/>
+          <w:bCs/>
+          <w:color w:val="FF0000"/>
+          <w:highlight w:val="none"/>
+          <w:lang w:val="en-US" w:eastAsia="zh-CN"/>
+        </w:rPr>
+        <w:t>注意：请将DOCX里面的标题样式全部改为“标题1”，“标题2”，“标题3”... ...</w:t>
       </w:r>
     </w:p>
     <w:p>
@@ -424,6 +433,19 @@
       <w:r>
         <w:t>上传仅含 DOCX 的 ZIP。</w:t>
       </w:r>
+      <w:r>
+        <w:rPr>
+          <w:rFonts w:hint="eastAsia"/>
+          <w:b/>
+          <w:bCs/>
+          <w:color w:val="FF0000"/>
+          <w:highlight w:val="none"/>
+          <w:lang w:val="en-US" w:eastAsia="zh-CN"/>
+        </w:rPr>
+        <w:t>注意：请将DOCX里面的标题样式全部改为“标题1”，“标题2”，“标题3”... ...</w:t>
+      </w:r>
+      <w:bookmarkStart w:id="0" w:name="_GoBack"/>
+      <w:bookmarkEnd w:id="0"/>
     </w:p>
     <w:p>
       <w:pPr>
@@ -453,6 +475,7 @@
       <w:pPr>
         <w:pStyle w:val="14"/>
         <w:numPr>
+          <w:ilvl w:val="0"/>
           <w:numId w:val="0"/>
         </w:numPr>
         <w:ind w:leftChars="0"/>
@@ -1943,6 +1966,14 @@
         <w:gridCol w:w="9972"/>
       </w:tblGrid>
       <w:tr>
+        <w:tblPrEx>
+          <w:tblCellMar>
+            <w:top w:w="0" w:type="dxa"/>
+            <w:left w:w="108" w:type="dxa"/>
+            <w:bottom w:w="0" w:type="dxa"/>
+            <w:right w:w="108" w:type="dxa"/>
+          </w:tblCellMar>
+        </w:tblPrEx>
         <w:trPr>
           <w:jc w:val="center"/>
         </w:trPr>
@@ -2473,7 +2504,7 @@
     <w:lsdException w:uiPriority="99" w:name="Normal Indent"/>
     <w:lsdException w:uiPriority="99" w:name="footnote text"/>
     <w:lsdException w:uiPriority="99" w:name="annotation text"/>
-    <w:lsdException w:uiPriority="99" w:semiHidden="0" w:name="header"/>
+    <w:lsdException w:qFormat="1" w:uiPriority="99" w:semiHidden="0" w:name="header"/>
     <w:lsdException w:qFormat="1" w:uiPriority="99" w:semiHidden="0" w:name="footer"/>
     <w:lsdException w:uiPriority="99" w:name="index heading"/>
     <w:lsdException w:qFormat="1" w:uiPriority="35" w:name="caption"/>
@@ -2490,29 +2521,29 @@
     <w:lsdException w:uiPriority="99" w:semiHidden="0" w:name="macro"/>
     <w:lsdException w:uiPriority="99" w:name="toa heading"/>
     <w:lsdException w:qFormat="1" w:uiPriority="99" w:semiHidden="0" w:name="List"/>
-    <w:lsdException w:uiPriority="99" w:semiHidden="0" w:name="List Bullet"/>
-    <w:lsdException w:uiPriority="99" w:semiHidden="0" w:name="List Number"/>
+    <w:lsdException w:qFormat="1" w:uiPriority="99" w:semiHidden="0" w:name="List Bullet"/>
+    <w:lsdException w:qFormat="1" w:uiPriority="99" w:semiHidden="0" w:name="List Number"/>
     <w:lsdException w:qFormat="1" w:uiPriority="99" w:semiHidden="0" w:name="List 2"/>
-    <w:lsdException w:uiPriority="99" w:semiHidden="0" w:name="List 3"/>
+    <w:lsdException w:qFormat="1" w:uiPriority="99" w:semiHidden="0" w:name="List 3"/>
     <w:lsdException w:uiPriority="99" w:name="List 4"/>
     <w:lsdException w:uiPriority="99" w:name="List 5"/>
-    <w:lsdException w:uiPriority="99" w:semiHidden="0" w:name="List Bullet 2"/>
+    <w:lsdException w:qFormat="1" w:uiPriority="99" w:semiHidden="0" w:name="List Bullet 2"/>
     <w:lsdException w:qFormat="1" w:uiPriority="99" w:semiHidden="0" w:name="List Bullet 3"/>
     <w:lsdException w:uiPriority="99" w:name="List Bullet 4"/>
     <w:lsdException w:uiPriority="99" w:name="List Bullet 5"/>
-    <w:lsdException w:uiPriority="99" w:semiHidden="0" w:name="List Number 2"/>
-    <w:lsdException w:uiPriority="99" w:semiHidden="0" w:name="List Number 3"/>
+    <w:lsdException w:qFormat="1" w:uiPriority="99" w:semiHidden="0" w:name="List Number 2"/>
+    <w:lsdException w:qFormat="1" w:uiPriority="99" w:semiHidden="0" w:name="List Number 3"/>
     <w:lsdException w:uiPriority="99" w:name="List Number 4"/>
     <w:lsdException w:uiPriority="99" w:name="List Number 5"/>
     <w:lsdException w:qFormat="1" w:unhideWhenUsed="0" w:uiPriority="10" w:semiHidden="0" w:name="Title"/>
     <w:lsdException w:uiPriority="99" w:name="Closing"/>
     <w:lsdException w:uiPriority="99" w:name="Signature"/>
     <w:lsdException w:qFormat="1" w:uiPriority="1" w:name="Default Paragraph Font"/>
-    <w:lsdException w:uiPriority="99" w:semiHidden="0" w:name="Body Text"/>
+    <w:lsdException w:qFormat="1" w:uiPriority="99" w:semiHidden="0" w:name="Body Text"/>
     <w:lsdException w:uiPriority="99" w:name="Body Text Indent"/>
     <w:lsdException w:qFormat="1" w:uiPriority="99" w:semiHidden="0" w:name="List Continue"/>
-    <w:lsdException w:uiPriority="99" w:semiHidden="0" w:name="List Continue 2"/>
-    <w:lsdException w:uiPriority="99" w:semiHidden="0" w:name="List Continue 3"/>
+    <w:lsdException w:qFormat="1" w:uiPriority="99" w:semiHidden="0" w:name="List Continue 2"/>
+    <w:lsdException w:qFormat="1" w:uiPriority="99" w:semiHidden="0" w:name="List Continue 3"/>
     <w:lsdException w:uiPriority="99" w:name="List Continue 4"/>
     <w:lsdException w:uiPriority="99" w:name="List Continue 5"/>
     <w:lsdException w:uiPriority="99" w:name="Message Header"/>
@@ -2522,7 +2553,7 @@
     <w:lsdException w:uiPriority="99" w:name="Body Text First Indent"/>
     <w:lsdException w:uiPriority="99" w:name="Body Text First Indent 2"/>
     <w:lsdException w:uiPriority="99" w:name="Note Heading"/>
-    <w:lsdException w:uiPriority="99" w:semiHidden="0" w:name="Body Text 2"/>
+    <w:lsdException w:qFormat="1" w:uiPriority="99" w:semiHidden="0" w:name="Body Text 2"/>
     <w:lsdException w:qFormat="1" w:uiPriority="99" w:semiHidden="0" w:name="Body Text 3"/>
     <w:lsdException w:uiPriority="99" w:name="Body Text Indent 2"/>
     <w:lsdException w:uiPriority="99" w:name="Body Text Indent 3"/>
@@ -2590,108 +2621,108 @@
     <w:lsdException w:uiPriority="99" w:name="Table Web 2"/>
     <w:lsdException w:uiPriority="99" w:name="Table Web 3"/>
     <w:lsdException w:uiPriority="99" w:name="Balloon Text"/>
-    <w:lsdException w:unhideWhenUsed="0" w:uiPriority="59" w:semiHidden="0" w:name="Table Grid"/>
+    <w:lsdException w:qFormat="1" w:unhideWhenUsed="0" w:uiPriority="59" w:semiHidden="0" w:name="Table Grid"/>
     <w:lsdException w:uiPriority="99" w:name="Table Theme"/>
     <w:lsdException w:qFormat="1" w:unhideWhenUsed="0" w:uiPriority="1" w:semiHidden="0" w:name="No Spacing"/>
-    <w:lsdException w:unhideWhenUsed="0" w:uiPriority="60" w:semiHidden="0" w:name="Light Shading"/>
-    <w:lsdException w:unhideWhenUsed="0" w:uiPriority="61" w:semiHidden="0" w:name="Light List"/>
-    <w:lsdException w:unhideWhenUsed="0" w:uiPriority="62" w:semiHidden="0" w:name="Light Grid"/>
-    <w:lsdException w:unhideWhenUsed="0" w:uiPriority="63" w:semiHidden="0" w:name="Medium Shading 1"/>
-    <w:lsdException w:unhideWhenUsed="0" w:uiPriority="64" w:semiHidden="0" w:name="Medium Shading 2"/>
-    <w:lsdException w:unhideWhenUsed="0" w:uiPriority="65" w:semiHidden="0" w:name="Medium List 1"/>
-    <w:lsdException w:unhideWhenUsed="0" w:uiPriority="66" w:semiHidden="0" w:name="Medium List 2"/>
-    <w:lsdException w:unhideWhenUsed="0" w:uiPriority="67" w:semiHidden="0" w:name="Medium Grid 1"/>
-    <w:lsdException w:unhideWhenUsed="0" w:uiPriority="68" w:semiHidden="0" w:name="Medium Grid 2"/>
-    <w:lsdException w:unhideWhenUsed="0" w:uiPriority="69" w:semiHidden="0" w:name="Medium Grid 3"/>
+    <w:lsdException w:qFormat="1" w:unhideWhenUsed="0" w:uiPriority="60" w:semiHidden="0" w:name="Light Shading"/>
+    <w:lsdException w:qFormat="1" w:unhideWhenUsed="0" w:uiPriority="61" w:semiHidden="0" w:name="Light List"/>
+    <w:lsdException w:qFormat="1" w:unhideWhenUsed="0" w:uiPriority="62" w:semiHidden="0" w:name="Light Grid"/>
+    <w:lsdException w:qFormat="1" w:unhideWhenUsed="0" w:uiPriority="63" w:semiHidden="0" w:name="Medium Shading 1"/>
+    <w:lsdException w:qFormat="1" w:unhideWhenUsed="0" w:uiPriority="64" w:semiHidden="0" w:name="Medium Shading 2"/>
+    <w:lsdException w:qFormat="1" w:unhideWhenUsed="0" w:uiPriority="65" w:semiHidden="0" w:name="Medium List 1"/>
+    <w:lsdException w:qFormat="1" w:unhideWhenUsed="0" w:uiPriority="66" w:semiHidden="0" w:name="Medium List 2"/>
+    <w:lsdException w:qFormat="1" w:unhideWhenUsed="0" w:uiPriority="67" w:semiHidden="0" w:name="Medium Grid 1"/>
+    <w:lsdException w:qFormat="1" w:unhideWhenUsed="0" w:uiPriority="68" w:semiHidden="0" w:name="Medium Grid 2"/>
+    <w:lsdException w:qFormat="1" w:unhideWhenUsed="0" w:uiPriority="69" w:semiHidden="0" w:name="Medium Grid 3"/>
     <w:lsdException w:unhideWhenUsed="0" w:uiPriority="70" w:semiHidden="0" w:name="Dark List"/>
     <w:lsdException w:unhideWhenUsed="0" w:uiPriority="71" w:semiHidden="0" w:name="Colorful Shading"/>
     <w:lsdException w:unhideWhenUsed="0" w:uiPriority="72" w:semiHidden="0" w:name="Colorful List"/>
-    <w:lsdException w:unhideWhenUsed="0" w:uiPriority="73" w:semiHidden="0" w:name="Colorful Grid"/>
-    <w:lsdException w:unhideWhenUsed="0" w:uiPriority="60" w:semiHidden="0" w:name="Light Shading Accent 1"/>
-    <w:lsdException w:unhideWhenUsed="0" w:uiPriority="61" w:semiHidden="0" w:name="Light List Accent 1"/>
-    <w:lsdException w:unhideWhenUsed="0" w:uiPriority="62" w:semiHidden="0" w:name="Light Grid Accent 1"/>
+    <w:lsdException w:qFormat="1" w:unhideWhenUsed="0" w:uiPriority="73" w:semiHidden="0" w:name="Colorful Grid"/>
+    <w:lsdException w:qFormat="1" w:unhideWhenUsed="0" w:uiPriority="60" w:semiHidden="0" w:name="Light Shading Accent 1"/>
+    <w:lsdException w:qFormat="1" w:unhideWhenUsed="0" w:uiPriority="61" w:semiHidden="0" w:name="Light List Accent 1"/>
+    <w:lsdException w:qFormat="1" w:unhideWhenUsed="0" w:uiPriority="62" w:semiHidden="0" w:name="Light Grid Accent 1"/>
     <w:lsdException w:unhideWhenUsed="0" w:uiPriority="63" w:semiHidden="0" w:name="Medium Shading 1 Accent 1"/>
-    <w:lsdException w:unhideWhenUsed="0" w:uiPriority="64" w:semiHidden="0" w:name="Medium Shading 2 Accent 1"/>
-    <w:lsdException w:unhideWhenUsed="0" w:uiPriority="65" w:semiHidden="0" w:name="Medium List 1 Accent 1"/>
+    <w:lsdException w:qFormat="1" w:unhideWhenUsed="0" w:uiPriority="64" w:semiHidden="0" w:name="Medium Shading 2 Accent 1"/>
+    <w:lsdException w:qFormat="1" w:unhideWhenUsed="0" w:uiPriority="65" w:semiHidden="0" w:name="Medium List 1 Accent 1"/>
     <w:lsdException w:qFormat="1" w:unhideWhenUsed="0" w:uiPriority="34" w:semiHidden="0" w:name="List Paragraph"/>
     <w:lsdException w:qFormat="1" w:unhideWhenUsed="0" w:uiPriority="29" w:semiHidden="0" w:name="Quote"/>
     <w:lsdException w:qFormat="1" w:unhideWhenUsed="0" w:uiPriority="30" w:semiHidden="0" w:name="Intense Quote"/>
-    <w:lsdException w:unhideWhenUsed="0" w:uiPriority="66" w:semiHidden="0" w:name="Medium List 2 Accent 1"/>
-    <w:lsdException w:unhideWhenUsed="0" w:uiPriority="67" w:semiHidden="0" w:name="Medium Grid 1 Accent 1"/>
-    <w:lsdException w:unhideWhenUsed="0" w:uiPriority="68" w:semiHidden="0" w:name="Medium Grid 2 Accent 1"/>
-    <w:lsdException w:unhideWhenUsed="0" w:uiPriority="69" w:semiHidden="0" w:name="Medium Grid 3 Accent 1"/>
+    <w:lsdException w:qFormat="1" w:unhideWhenUsed="0" w:uiPriority="66" w:semiHidden="0" w:name="Medium List 2 Accent 1"/>
+    <w:lsdException w:qFormat="1" w:unhideWhenUsed="0" w:uiPriority="67" w:semiHidden="0" w:name="Medium Grid 1 Accent 1"/>
+    <w:lsdException w:qFormat="1" w:unhideWhenUsed="0" w:uiPriority="68" w:semiHidden="0" w:name="Medium Grid 2 Accent 1"/>
+    <w:lsdException w:qFormat="1" w:unhideWhenUsed="0" w:uiPriority="69" w:semiHidden="0" w:name="Medium Grid 3 Accent 1"/>
     <w:lsdException w:unhideWhenUsed="0" w:uiPriority="70" w:semiHidden="0" w:name="Dark List Accent 1"/>
     <w:lsdException w:unhideWhenUsed="0" w:uiPriority="71" w:semiHidden="0" w:name="Colorful Shading Accent 1"/>
     <w:lsdException w:unhideWhenUsed="0" w:uiPriority="72" w:semiHidden="0" w:name="Colorful List Accent 1"/>
     <w:lsdException w:unhideWhenUsed="0" w:uiPriority="73" w:semiHidden="0" w:name="Colorful Grid Accent 1"/>
-    <w:lsdException w:unhideWhenUsed="0" w:uiPriority="60" w:semiHidden="0" w:name="Light Shading Accent 2"/>
-    <w:lsdException w:unhideWhenUsed="0" w:uiPriority="61" w:semiHidden="0" w:name="Light List Accent 2"/>
-    <w:lsdException w:unhideWhenUsed="0" w:uiPriority="62" w:semiHidden="0" w:name="Light Grid Accent 2"/>
+    <w:lsdException w:qFormat="1" w:unhideWhenUsed="0" w:uiPriority="60" w:semiHidden="0" w:name="Light Shading Accent 2"/>
+    <w:lsdException w:qFormat="1" w:unhideWhenUsed="0" w:uiPriority="61" w:semiHidden="0" w:name="Light List Accent 2"/>
+    <w:lsdException w:qFormat="1" w:unhideWhenUsed="0" w:uiPriority="62" w:semiHidden="0" w:name="Light Grid Accent 2"/>
     <w:lsdException w:unhideWhenUsed="0" w:uiPriority="63" w:semiHidden="0" w:name="Medium Shading 1 Accent 2"/>
-    <w:lsdException w:unhideWhenUsed="0" w:uiPriority="64" w:semiHidden="0" w:name="Medium Shading 2 Accent 2"/>
-    <w:lsdException w:unhideWhenUsed="0" w:uiPriority="65" w:semiHidden="0" w:name="Medium List 1 Accent 2"/>
-    <w:lsdException w:unhideWhenUsed="0" w:uiPriority="66" w:semiHidden="0" w:name="Medium List 2 Accent 2"/>
-    <w:lsdException w:unhideWhenUsed="0" w:uiPriority="67" w:semiHidden="0" w:name="Medium Grid 1 Accent 2"/>
-    <w:lsdException w:unhideWhenUsed="0" w:uiPriority="68" w:semiHidden="0" w:name="Medium Grid 2 Accent 2"/>
-    <w:lsdException w:unhideWhenUsed="0" w:uiPriority="69" w:semiHidden="0" w:name="Medium Grid 3 Accent 2"/>
+    <w:lsdException w:qFormat="1" w:unhideWhenUsed="0" w:uiPriority="64" w:semiHidden="0" w:name="Medium Shading 2 Accent 2"/>
+    <w:lsdException w:qFormat="1" w:unhideWhenUsed="0" w:uiPriority="65" w:semiHidden="0" w:name="Medium List 1 Accent 2"/>
+    <w:lsdException w:qFormat="1" w:unhideWhenUsed="0" w:uiPriority="66" w:semiHidden="0" w:name="Medium List 2 Accent 2"/>
+    <w:lsdException w:qFormat="1" w:unhideWhenUsed="0" w:uiPriority="67" w:semiHidden="0" w:name="Medium Grid 1 Accent 2"/>
+    <w:lsdException w:qFormat="1" w:unhideWhenUsed="0" w:uiPriority="68" w:semiHidden="0" w:name="Medium Grid 2 Accent 2"/>
+    <w:lsdException w:qFormat="1" w:unhideWhenUsed="0" w:uiPriority="69" w:semiHidden="0" w:name="Medium Grid 3 Accent 2"/>
     <w:lsdException w:unhideWhenUsed="0" w:uiPriority="70" w:semiHidden="0" w:name="Dark List Accent 2"/>
     <w:lsdException w:unhideWhenUsed="0" w:uiPriority="71" w:semiHidden="0" w:name="Colorful Shading Accent 2"/>
     <w:lsdException w:unhideWhenUsed="0" w:uiPriority="72" w:semiHidden="0" w:name="Colorful List Accent 2"/>
     <w:lsdException w:unhideWhenUsed="0" w:uiPriority="73" w:semiHidden="0" w:name="Colorful Grid Accent 2"/>
-    <w:lsdException w:unhideWhenUsed="0" w:uiPriority="60" w:semiHidden="0" w:name="Light Shading Accent 3"/>
+    <w:lsdException w:qFormat="1" w:unhideWhenUsed="0" w:uiPriority="60" w:semiHidden="0" w:name="Light Shading Accent 3"/>
     <w:lsdException w:unhideWhenUsed="0" w:uiPriority="61" w:semiHidden="0" w:name="Light List Accent 3"/>
     <w:lsdException w:unhideWhenUsed="0" w:uiPriority="62" w:semiHidden="0" w:name="Light Grid Accent 3"/>
-    <w:lsdException w:unhideWhenUsed="0" w:uiPriority="63" w:semiHidden="0" w:name="Medium Shading 1 Accent 3"/>
-    <w:lsdException w:unhideWhenUsed="0" w:uiPriority="64" w:semiHidden="0" w:name="Medium Shading 2 Accent 3"/>
-    <w:lsdException w:unhideWhenUsed="0" w:uiPriority="65" w:semiHidden="0" w:name="Medium List 1 Accent 3"/>
-    <w:lsdException w:unhideWhenUsed="0" w:uiPriority="66" w:semiHidden="0" w:name="Medium List 2 Accent 3"/>
-    <w:lsdException w:unhideWhenUsed="0" w:uiPriority="67" w:semiHidden="0" w:name="Medium Grid 1 Accent 3"/>
-    <w:lsdException w:unhideWhenUsed="0" w:uiPriority="68" w:semiHidden="0" w:name="Medium Grid 2 Accent 3"/>
-    <w:lsdException w:unhideWhenUsed="0" w:uiPriority="69" w:semiHidden="0" w:name="Medium Grid 3 Accent 3"/>
+    <w:lsdException w:qFormat="1" w:unhideWhenUsed="0" w:uiPriority="63" w:semiHidden="0" w:name="Medium Shading 1 Accent 3"/>
+    <w:lsdException w:qFormat="1" w:unhideWhenUsed="0" w:uiPriority="64" w:semiHidden="0" w:name="Medium Shading 2 Accent 3"/>
+    <w:lsdException w:qFormat="1" w:unhideWhenUsed="0" w:uiPriority="65" w:semiHidden="0" w:name="Medium List 1 Accent 3"/>
+    <w:lsdException w:qFormat="1" w:unhideWhenUsed="0" w:uiPriority="66" w:semiHidden="0" w:name="Medium List 2 Accent 3"/>
+    <w:lsdException w:qFormat="1" w:unhideWhenUsed="0" w:uiPriority="67" w:semiHidden="0" w:name="Medium Grid 1 Accent 3"/>
+    <w:lsdException w:qFormat="1" w:unhideWhenUsed="0" w:uiPriority="68" w:semiHidden="0" w:name="Medium Grid 2 Accent 3"/>
+    <w:lsdException w:qFormat="1" w:unhideWhenUsed="0" w:uiPriority="69" w:semiHidden="0" w:name="Medium Grid 3 Accent 3"/>
     <w:lsdException w:unhideWhenUsed="0" w:uiPriority="70" w:semiHidden="0" w:name="Dark List Accent 3"/>
     <w:lsdException w:unhideWhenUsed="0" w:uiPriority="71" w:semiHidden="0" w:name="Colorful Shading Accent 3"/>
     <w:lsdException w:unhideWhenUsed="0" w:uiPriority="72" w:semiHidden="0" w:name="Colorful List Accent 3"/>
     <w:lsdException w:unhideWhenUsed="0" w:uiPriority="73" w:semiHidden="0" w:name="Colorful Grid Accent 3"/>
-    <w:lsdException w:unhideWhenUsed="0" w:uiPriority="60" w:semiHidden="0" w:name="Light Shading Accent 4"/>
-    <w:lsdException w:unhideWhenUsed="0" w:uiPriority="61" w:semiHidden="0" w:name="Light List Accent 4"/>
-    <w:lsdException w:unhideWhenUsed="0" w:uiPriority="62" w:semiHidden="0" w:name="Light Grid Accent 4"/>
-    <w:lsdException w:unhideWhenUsed="0" w:uiPriority="63" w:semiHidden="0" w:name="Medium Shading 1 Accent 4"/>
+    <w:lsdException w:qFormat="1" w:unhideWhenUsed="0" w:uiPriority="60" w:semiHidden="0" w:name="Light Shading Accent 4"/>
+    <w:lsdException w:qFormat="1" w:unhideWhenUsed="0" w:uiPriority="61" w:semiHidden="0" w:name="Light List Accent 4"/>
+    <w:lsdException w:qFormat="1" w:unhideWhenUsed="0" w:uiPriority="62" w:semiHidden="0" w:name="Light Grid Accent 4"/>
+    <w:lsdException w:qFormat="1" w:unhideWhenUsed="0" w:uiPriority="63" w:semiHidden="0" w:name="Medium Shading 1 Accent 4"/>
     <w:lsdException w:unhideWhenUsed="0" w:uiPriority="64" w:semiHidden="0" w:name="Medium Shading 2 Accent 4"/>
     <w:lsdException w:unhideWhenUsed="0" w:uiPriority="65" w:semiHidden="0" w:name="Medium List 1 Accent 4"/>
-    <w:lsdException w:unhideWhenUsed="0" w:uiPriority="66" w:semiHidden="0" w:name="Medium List 2 Accent 4"/>
-    <w:lsdException w:unhideWhenUsed="0" w:uiPriority="67" w:semiHidden="0" w:name="Medium Grid 1 Accent 4"/>
-    <w:lsdException w:unhideWhenUsed="0" w:uiPriority="68" w:semiHidden="0" w:name="Medium Grid 2 Accent 4"/>
-    <w:lsdException w:unhideWhenUsed="0" w:uiPriority="69" w:semiHidden="0" w:name="Medium Grid 3 Accent 4"/>
+    <w:lsdException w:qFormat="1" w:unhideWhenUsed="0" w:uiPriority="66" w:semiHidden="0" w:name="Medium List 2 Accent 4"/>
+    <w:lsdException w:qFormat="1" w:unhideWhenUsed="0" w:uiPriority="67" w:semiHidden="0" w:name="Medium Grid 1 Accent 4"/>
+    <w:lsdException w:qFormat="1" w:unhideWhenUsed="0" w:uiPriority="68" w:semiHidden="0" w:name="Medium Grid 2 Accent 4"/>
+    <w:lsdException w:qFormat="1" w:unhideWhenUsed="0" w:uiPriority="69" w:semiHidden="0" w:name="Medium Grid 3 Accent 4"/>
     <w:lsdException w:unhideWhenUsed="0" w:uiPriority="70" w:semiHidden="0" w:name="Dark List Accent 4"/>
     <w:lsdException w:unhideWhenUsed="0" w:uiPriority="71" w:semiHidden="0" w:name="Colorful Shading Accent 4"/>
     <w:lsdException w:unhideWhenUsed="0" w:uiPriority="72" w:semiHidden="0" w:name="Colorful List Accent 4"/>
     <w:lsdException w:unhideWhenUsed="0" w:uiPriority="73" w:semiHidden="0" w:name="Colorful Grid Accent 4"/>
-    <w:lsdException w:unhideWhenUsed="0" w:uiPriority="60" w:semiHidden="0" w:name="Light Shading Accent 5"/>
-    <w:lsdException w:unhideWhenUsed="0" w:uiPriority="61" w:semiHidden="0" w:name="Light List Accent 5"/>
-    <w:lsdException w:unhideWhenUsed="0" w:uiPriority="62" w:semiHidden="0" w:name="Light Grid Accent 5"/>
-    <w:lsdException w:unhideWhenUsed="0" w:uiPriority="63" w:semiHidden="0" w:name="Medium Shading 1 Accent 5"/>
-    <w:lsdException w:unhideWhenUsed="0" w:uiPriority="64" w:semiHidden="0" w:name="Medium Shading 2 Accent 5"/>
+    <w:lsdException w:qFormat="1" w:unhideWhenUsed="0" w:uiPriority="60" w:semiHidden="0" w:name="Light Shading Accent 5"/>
+    <w:lsdException w:qFormat="1" w:unhideWhenUsed="0" w:uiPriority="61" w:semiHidden="0" w:name="Light List Accent 5"/>
+    <w:lsdException w:qFormat="1" w:unhideWhenUsed="0" w:uiPriority="62" w:semiHidden="0" w:name="Light Grid Accent 5"/>
+    <w:lsdException w:qFormat="1" w:unhideWhenUsed="0" w:uiPriority="63" w:semiHidden="0" w:name="Medium Shading 1 Accent 5"/>
+    <w:lsdException w:qFormat="1" w:unhideWhenUsed="0" w:uiPriority="64" w:semiHidden="0" w:name="Medium Shading 2 Accent 5"/>
     <w:lsdException w:unhideWhenUsed="0" w:uiPriority="65" w:semiHidden="0" w:name="Medium List 1 Accent 5"/>
-    <w:lsdException w:unhideWhenUsed="0" w:uiPriority="66" w:semiHidden="0" w:name="Medium List 2 Accent 5"/>
-    <w:lsdException w:unhideWhenUsed="0" w:uiPriority="67" w:semiHidden="0" w:name="Medium Grid 1 Accent 5"/>
-    <w:lsdException w:unhideWhenUsed="0" w:uiPriority="68" w:semiHidden="0" w:name="Medium Grid 2 Accent 5"/>
+    <w:lsdException w:qFormat="1" w:unhideWhenUsed="0" w:uiPriority="66" w:semiHidden="0" w:name="Medium List 2 Accent 5"/>
+    <w:lsdException w:qFormat="1" w:unhideWhenUsed="0" w:uiPriority="67" w:semiHidden="0" w:name="Medium Grid 1 Accent 5"/>
+    <w:lsdException w:qFormat="1" w:unhideWhenUsed="0" w:uiPriority="68" w:semiHidden="0" w:name="Medium Grid 2 Accent 5"/>
     <w:lsdException w:unhideWhenUsed="0" w:uiPriority="69" w:semiHidden="0" w:name="Medium Grid 3 Accent 5"/>
-    <w:lsdException w:unhideWhenUsed="0" w:uiPriority="70" w:semiHidden="0" w:name="Dark List Accent 5"/>
+    <w:lsdException w:qFormat="1" w:unhideWhenUsed="0" w:uiPriority="70" w:semiHidden="0" w:name="Dark List Accent 5"/>
     <w:lsdException w:unhideWhenUsed="0" w:uiPriority="71" w:semiHidden="0" w:name="Colorful Shading Accent 5"/>
-    <w:lsdException w:unhideWhenUsed="0" w:uiPriority="72" w:semiHidden="0" w:name="Colorful List Accent 5"/>
+    <w:lsdException w:qFormat="1" w:unhideWhenUsed="0" w:uiPriority="72" w:semiHidden="0" w:name="Colorful List Accent 5"/>
     <w:lsdException w:unhideWhenUsed="0" w:uiPriority="73" w:semiHidden="0" w:name="Colorful Grid Accent 5"/>
-    <w:lsdException w:unhideWhenUsed="0" w:uiPriority="60" w:semiHidden="0" w:name="Light Shading Accent 6"/>
-    <w:lsdException w:unhideWhenUsed="0" w:uiPriority="61" w:semiHidden="0" w:name="Light List Accent 6"/>
+    <w:lsdException w:qFormat="1" w:unhideWhenUsed="0" w:uiPriority="60" w:semiHidden="0" w:name="Light Shading Accent 6"/>
+    <w:lsdException w:qFormat="1" w:unhideWhenUsed="0" w:uiPriority="61" w:semiHidden="0" w:name="Light List Accent 6"/>
     <w:lsdException w:unhideWhenUsed="0" w:uiPriority="62" w:semiHidden="0" w:name="Light Grid Accent 6"/>
     <w:lsdException w:unhideWhenUsed="0" w:uiPriority="63" w:semiHidden="0" w:name="Medium Shading 1 Accent 6"/>
-    <w:lsdException w:unhideWhenUsed="0" w:uiPriority="64" w:semiHidden="0" w:name="Medium Shading 2 Accent 6"/>
-    <w:lsdException w:unhideWhenUsed="0" w:uiPriority="65" w:semiHidden="0" w:name="Medium List 1 Accent 6"/>
-    <w:lsdException w:unhideWhenUsed="0" w:uiPriority="66" w:semiHidden="0" w:name="Medium List 2 Accent 6"/>
-    <w:lsdException w:unhideWhenUsed="0" w:uiPriority="67" w:semiHidden="0" w:name="Medium Grid 1 Accent 6"/>
-    <w:lsdException w:unhideWhenUsed="0" w:uiPriority="68" w:semiHidden="0" w:name="Medium Grid 2 Accent 6"/>
+    <w:lsdException w:qFormat="1" w:unhideWhenUsed="0" w:uiPriority="64" w:semiHidden="0" w:name="Medium Shading 2 Accent 6"/>
+    <w:lsdException w:qFormat="1" w:unhideWhenUsed="0" w:uiPriority="65" w:semiHidden="0" w:name="Medium List 1 Accent 6"/>
+    <w:lsdException w:qFormat="1" w:unhideWhenUsed="0" w:uiPriority="66" w:semiHidden="0" w:name="Medium List 2 Accent 6"/>
+    <w:lsdException w:qFormat="1" w:unhideWhenUsed="0" w:uiPriority="67" w:semiHidden="0" w:name="Medium Grid 1 Accent 6"/>
+    <w:lsdException w:qFormat="1" w:unhideWhenUsed="0" w:uiPriority="68" w:semiHidden="0" w:name="Medium Grid 2 Accent 6"/>
     <w:lsdException w:unhideWhenUsed="0" w:uiPriority="69" w:semiHidden="0" w:name="Medium Grid 3 Accent 6"/>
     <w:lsdException w:unhideWhenUsed="0" w:uiPriority="70" w:semiHidden="0" w:name="Dark List Accent 6"/>
-    <w:lsdException w:unhideWhenUsed="0" w:uiPriority="71" w:semiHidden="0" w:name="Colorful Shading Accent 6"/>
+    <w:lsdException w:qFormat="1" w:unhideWhenUsed="0" w:uiPriority="71" w:semiHidden="0" w:name="Colorful Shading Accent 6"/>
     <w:lsdException w:unhideWhenUsed="0" w:uiPriority="72" w:semiHidden="0" w:name="Colorful List Accent 6"/>
     <w:lsdException w:unhideWhenUsed="0" w:uiPriority="73" w:semiHidden="0" w:name="Colorful Grid Accent 6"/>
   </w:latentStyles>
@@ -2991,6 +3022,7 @@
     <w:name w:val="List 3"/>
     <w:basedOn w:val="1"/>
     <w:unhideWhenUsed/>
+    <w:qFormat/>
     <w:uiPriority w:val="99"/>
     <w:pPr>
       <w:ind w:left="1080" w:hanging="360"/>
@@ -3001,6 +3033,7 @@
     <w:name w:val="List Number 2"/>
     <w:basedOn w:val="1"/>
     <w:unhideWhenUsed/>
+    <w:qFormat/>
     <w:uiPriority w:val="99"/>
     <w:pPr>
       <w:numPr>
@@ -3014,6 +3047,7 @@
     <w:name w:val="List Number"/>
     <w:basedOn w:val="1"/>
     <w:unhideWhenUsed/>
+    <w:qFormat/>
     <w:uiPriority w:val="99"/>
     <w:pPr>
       <w:numPr>
@@ -3051,6 +3085,7 @@
     <w:name w:val="List Bullet"/>
     <w:basedOn w:val="1"/>
     <w:unhideWhenUsed/>
+    <w:qFormat/>
     <w:uiPriority w:val="99"/>
     <w:pPr>
       <w:numPr>
@@ -3094,6 +3129,7 @@
     <w:basedOn w:val="1"/>
     <w:link w:val="144"/>
     <w:unhideWhenUsed/>
+    <w:qFormat/>
     <w:uiPriority w:val="99"/>
     <w:pPr>
       <w:spacing w:after="120"/>
@@ -3103,6 +3139,7 @@
     <w:name w:val="List Number 3"/>
     <w:basedOn w:val="1"/>
     <w:unhideWhenUsed/>
+    <w:qFormat/>
     <w:uiPriority w:val="99"/>
     <w:pPr>
       <w:numPr>
@@ -3139,6 +3176,7 @@
     <w:name w:val="List Bullet 2"/>
     <w:basedOn w:val="1"/>
     <w:unhideWhenUsed/>
+    <w:qFormat/>
     <w:uiPriority w:val="99"/>
     <w:pPr>
       <w:numPr>
@@ -3168,6 +3206,7 @@
     <w:basedOn w:val="1"/>
     <w:link w:val="135"/>
     <w:unhideWhenUsed/>
+    <w:qFormat/>
     <w:uiPriority w:val="99"/>
     <w:pPr>
       <w:tabs>
@@ -3215,6 +3254,7 @@
     <w:basedOn w:val="1"/>
     <w:link w:val="145"/>
     <w:unhideWhenUsed/>
+    <w:qFormat/>
     <w:uiPriority w:val="99"/>
     <w:pPr>
       <w:spacing w:after="120" w:line="480" w:lineRule="auto"/>
@@ -3224,6 +3264,7 @@
     <w:name w:val="List Continue 2"/>
     <w:basedOn w:val="1"/>
     <w:unhideWhenUsed/>
+    <w:qFormat/>
     <w:uiPriority w:val="99"/>
     <w:pPr>
       <w:spacing w:after="120"/>
@@ -3235,6 +3276,7 @@
     <w:name w:val="List Continue 3"/>
     <w:basedOn w:val="1"/>
     <w:unhideWhenUsed/>
+    <w:qFormat/>
     <w:uiPriority w:val="99"/>
     <w:pPr>
       <w:spacing w:after="120"/>
@@ -3268,6 +3310,7 @@
   <w:style w:type="table" w:styleId="33">
     <w:name w:val="Table Grid"/>
     <w:basedOn w:val="32"/>
+    <w:qFormat/>
     <w:uiPriority w:val="59"/>
     <w:pPr>
       <w:spacing w:after="0" w:line="240" w:lineRule="auto"/>
@@ -3292,6 +3335,7 @@
   <w:style w:type="table" w:styleId="34">
     <w:name w:val="Light Shading"/>
     <w:basedOn w:val="32"/>
+    <w:qFormat/>
     <w:uiPriority w:val="60"/>
     <w:pPr>
       <w:spacing w:after="0" w:line="240" w:lineRule="auto"/>
@@ -3391,6 +3435,7 @@
   <w:style w:type="table" w:styleId="35">
     <w:name w:val="Light Shading Accent 1"/>
     <w:basedOn w:val="32"/>
+    <w:qFormat/>
     <w:uiPriority w:val="60"/>
     <w:pPr>
       <w:spacing w:after="0" w:line="240" w:lineRule="auto"/>
@@ -3490,6 +3535,7 @@
   <w:style w:type="table" w:styleId="36">
     <w:name w:val="Light Shading Accent 2"/>
     <w:basedOn w:val="32"/>
+    <w:qFormat/>
     <w:uiPriority w:val="60"/>
     <w:pPr>
       <w:spacing w:after="0" w:line="240" w:lineRule="auto"/>
@@ -3589,6 +3635,7 @@
   <w:style w:type="table" w:styleId="37">
     <w:name w:val="Light Shading Accent 3"/>
     <w:basedOn w:val="32"/>
+    <w:qFormat/>
     <w:uiPriority w:val="60"/>
     <w:pPr>
       <w:spacing w:after="0" w:line="240" w:lineRule="auto"/>
@@ -3688,6 +3735,7 @@
   <w:style w:type="table" w:styleId="38">
     <w:name w:val="Light Shading Accent 4"/>
     <w:basedOn w:val="32"/>
+    <w:qFormat/>
     <w:uiPriority w:val="60"/>
     <w:pPr>
       <w:spacing w:after="0" w:line="240" w:lineRule="auto"/>
@@ -3787,6 +3835,7 @@
   <w:style w:type="table" w:styleId="39">
     <w:name w:val="Light Shading Accent 5"/>
     <w:basedOn w:val="32"/>
+    <w:qFormat/>
     <w:uiPriority w:val="60"/>
     <w:pPr>
       <w:spacing w:after="0" w:line="240" w:lineRule="auto"/>
@@ -3886,6 +3935,7 @@
   <w:style w:type="table" w:styleId="40">
     <w:name w:val="Light Shading Accent 6"/>
     <w:basedOn w:val="32"/>
+    <w:qFormat/>
     <w:uiPriority w:val="60"/>
     <w:pPr>
       <w:spacing w:after="0" w:line="240" w:lineRule="auto"/>
@@ -3985,6 +4035,7 @@
   <w:style w:type="table" w:styleId="41">
     <w:name w:val="Light List"/>
     <w:basedOn w:val="32"/>
+    <w:qFormat/>
     <w:uiPriority w:val="61"/>
     <w:pPr>
       <w:spacing w:after="0" w:line="240" w:lineRule="auto"/>
@@ -4078,6 +4129,7 @@
   <w:style w:type="table" w:styleId="42">
     <w:name w:val="Light List Accent 1"/>
     <w:basedOn w:val="32"/>
+    <w:qFormat/>
     <w:uiPriority w:val="61"/>
     <w:pPr>
       <w:spacing w:after="0" w:line="240" w:lineRule="auto"/>
@@ -4171,6 +4223,7 @@
   <w:style w:type="table" w:styleId="43">
     <w:name w:val="Light List Accent 2"/>
     <w:basedOn w:val="32"/>
+    <w:qFormat/>
     <w:uiPriority w:val="61"/>
     <w:pPr>
       <w:spacing w:after="0" w:line="240" w:lineRule="auto"/>
@@ -4357,6 +4410,7 @@
   <w:style w:type="table" w:styleId="45">
     <w:name w:val="Light List Accent 4"/>
     <w:basedOn w:val="32"/>
+    <w:qFormat/>
     <w:uiPriority w:val="61"/>
     <w:pPr>
       <w:spacing w:after="0" w:line="240" w:lineRule="auto"/>
@@ -4450,6 +4504,7 @@
   <w:style w:type="table" w:styleId="46">
     <w:name w:val="Light List Accent 5"/>
     <w:basedOn w:val="32"/>
+    <w:qFormat/>
     <w:uiPriority w:val="61"/>
     <w:pPr>
       <w:spacing w:after="0" w:line="240" w:lineRule="auto"/>
@@ -4543,6 +4598,7 @@
   <w:style w:type="table" w:styleId="47">
     <w:name w:val="Light List Accent 6"/>
     <w:basedOn w:val="32"/>
+    <w:qFormat/>
     <w:uiPriority w:val="61"/>
     <w:pPr>
       <w:spacing w:after="0" w:line="240" w:lineRule="auto"/>
@@ -4636,6 +4692,7 @@
   <w:style w:type="table" w:styleId="48">
     <w:name w:val="Light Grid"/>
     <w:basedOn w:val="32"/>
+    <w:qFormat/>
     <w:uiPriority w:val="62"/>
     <w:pPr>
       <w:spacing w:after="0" w:line="240" w:lineRule="auto"/>
@@ -4762,6 +4819,7 @@
   <w:style w:type="table" w:styleId="49">
     <w:name w:val="Light Grid Accent 1"/>
     <w:basedOn w:val="32"/>
+    <w:qFormat/>
     <w:uiPriority w:val="62"/>
     <w:pPr>
       <w:spacing w:after="0" w:line="240" w:lineRule="auto"/>
@@ -4888,6 +4946,7 @@
   <w:style w:type="table" w:styleId="50">
     <w:name w:val="Light Grid Accent 2"/>
     <w:basedOn w:val="32"/>
+    <w:qFormat/>
     <w:uiPriority w:val="62"/>
     <w:pPr>
       <w:spacing w:after="0" w:line="240" w:lineRule="auto"/>
@@ -5140,6 +5199,7 @@
   <w:style w:type="table" w:styleId="52">
     <w:name w:val="Light Grid Accent 4"/>
     <w:basedOn w:val="32"/>
+    <w:qFormat/>
     <w:uiPriority w:val="62"/>
     <w:pPr>
       <w:spacing w:after="0" w:line="240" w:lineRule="auto"/>
@@ -5266,6 +5326,7 @@
   <w:style w:type="table" w:styleId="53">
     <w:name w:val="Light Grid Accent 5"/>
     <w:basedOn w:val="32"/>
+    <w:qFormat/>
     <w:uiPriority w:val="62"/>
     <w:pPr>
       <w:spacing w:after="0" w:line="240" w:lineRule="auto"/>
@@ -5518,6 +5579,7 @@
   <w:style w:type="table" w:styleId="55">
     <w:name w:val="Medium Shading 1"/>
     <w:basedOn w:val="32"/>
+    <w:qFormat/>
     <w:uiPriority w:val="63"/>
     <w:pPr>
       <w:spacing w:after="0" w:line="240" w:lineRule="auto"/>
@@ -5839,6 +5901,7 @@
   <w:style w:type="table" w:styleId="58">
     <w:name w:val="Medium Shading 1 Accent 3"/>
     <w:basedOn w:val="32"/>
+    <w:qFormat/>
     <w:uiPriority w:val="63"/>
     <w:pPr>
       <w:spacing w:after="0" w:line="240" w:lineRule="auto"/>
@@ -5946,6 +6009,7 @@
   <w:style w:type="table" w:styleId="59">
     <w:name w:val="Medium Shading 1 Accent 4"/>
     <w:basedOn w:val="32"/>
+    <w:qFormat/>
     <w:uiPriority w:val="63"/>
     <w:pPr>
       <w:spacing w:after="0" w:line="240" w:lineRule="auto"/>
@@ -6053,6 +6117,7 @@
   <w:style w:type="table" w:styleId="60">
     <w:name w:val="Medium Shading 1 Accent 5"/>
     <w:basedOn w:val="32"/>
+    <w:qFormat/>
     <w:uiPriority w:val="63"/>
     <w:pPr>
       <w:spacing w:after="0" w:line="240" w:lineRule="auto"/>
@@ -6267,6 +6332,7 @@
   <w:style w:type="table" w:styleId="62">
     <w:name w:val="Medium Shading 2"/>
     <w:basedOn w:val="32"/>
+    <w:qFormat/>
     <w:uiPriority w:val="64"/>
     <w:pPr>
       <w:spacing w:after="0" w:line="240" w:lineRule="auto"/>
@@ -6432,6 +6498,7 @@
   <w:style w:type="table" w:styleId="63">
     <w:name w:val="Medium Shading 2 Accent 1"/>
     <w:basedOn w:val="32"/>
+    <w:qFormat/>
     <w:uiPriority w:val="64"/>
     <w:pPr>
       <w:spacing w:after="0" w:line="240" w:lineRule="auto"/>
@@ -6597,6 +6664,7 @@
   <w:style w:type="table" w:styleId="64">
     <w:name w:val="Medium Shading 2 Accent 2"/>
     <w:basedOn w:val="32"/>
+    <w:qFormat/>
     <w:uiPriority w:val="64"/>
     <w:pPr>
       <w:spacing w:after="0" w:line="240" w:lineRule="auto"/>
@@ -6762,6 +6830,7 @@
   <w:style w:type="table" w:styleId="65">
     <w:name w:val="Medium Shading 2 Accent 3"/>
     <w:basedOn w:val="32"/>
+    <w:qFormat/>
     <w:uiPriority w:val="64"/>
     <w:pPr>
       <w:spacing w:after="0" w:line="240" w:lineRule="auto"/>
@@ -7092,6 +7161,7 @@
   <w:style w:type="table" w:styleId="67">
     <w:name w:val="Medium Shading 2 Accent 5"/>
     <w:basedOn w:val="32"/>
+    <w:qFormat/>
     <w:uiPriority w:val="64"/>
     <w:pPr>
       <w:spacing w:after="0" w:line="240" w:lineRule="auto"/>
@@ -7257,6 +7327,7 @@
   <w:style w:type="table" w:styleId="68">
     <w:name w:val="Medium Shading 2 Accent 6"/>
     <w:basedOn w:val="32"/>
+    <w:qFormat/>
     <w:uiPriority w:val="64"/>
     <w:pPr>
       <w:spacing w:after="0" w:line="240" w:lineRule="auto"/>
@@ -7422,6 +7493,7 @@
   <w:style w:type="table" w:styleId="69">
     <w:name w:val="Medium List 1"/>
     <w:basedOn w:val="32"/>
+    <w:qFormat/>
     <w:uiPriority w:val="65"/>
     <w:pPr>
       <w:spacing w:after="0" w:line="240" w:lineRule="auto"/>
@@ -7512,6 +7584,7 @@
   <w:style w:type="table" w:styleId="70">
     <w:name w:val="Medium List 1 Accent 1"/>
     <w:basedOn w:val="32"/>
+    <w:qFormat/>
     <w:uiPriority w:val="65"/>
     <w:pPr>
       <w:spacing w:after="0" w:line="240" w:lineRule="auto"/>
@@ -7602,6 +7675,7 @@
   <w:style w:type="table" w:styleId="71">
     <w:name w:val="Medium List 1 Accent 2"/>
     <w:basedOn w:val="32"/>
+    <w:qFormat/>
     <w:uiPriority w:val="65"/>
     <w:pPr>
       <w:spacing w:after="0" w:line="240" w:lineRule="auto"/>
@@ -7692,6 +7766,7 @@
   <w:style w:type="table" w:styleId="72">
     <w:name w:val="Medium List 1 Accent 3"/>
     <w:basedOn w:val="32"/>
+    <w:qFormat/>
     <w:uiPriority w:val="65"/>
     <w:pPr>
       <w:spacing w:after="0" w:line="240" w:lineRule="auto"/>
@@ -7962,6 +8037,7 @@
   <w:style w:type="table" w:styleId="75">
     <w:name w:val="Medium List 1 Accent 6"/>
     <w:basedOn w:val="32"/>
+    <w:qFormat/>
     <w:uiPriority w:val="65"/>
     <w:pPr>
       <w:spacing w:after="0" w:line="240" w:lineRule="auto"/>
@@ -8052,6 +8128,7 @@
   <w:style w:type="table" w:styleId="76">
     <w:name w:val="Medium List 2"/>
     <w:basedOn w:val="32"/>
+    <w:qFormat/>
     <w:uiPriority w:val="66"/>
     <w:pPr>
       <w:spacing w:after="0" w:line="240" w:lineRule="auto"/>
@@ -8181,6 +8258,7 @@
   <w:style w:type="table" w:styleId="77">
     <w:name w:val="Medium List 2 Accent 1"/>
     <w:basedOn w:val="32"/>
+    <w:qFormat/>
     <w:uiPriority w:val="66"/>
     <w:pPr>
       <w:spacing w:after="0" w:line="240" w:lineRule="auto"/>
@@ -8310,6 +8388,7 @@
   <w:style w:type="table" w:styleId="78">
     <w:name w:val="Medium List 2 Accent 2"/>
     <w:basedOn w:val="32"/>
+    <w:qFormat/>
     <w:uiPriority w:val="66"/>
     <w:pPr>
       <w:spacing w:after="0" w:line="240" w:lineRule="auto"/>
@@ -8439,6 +8518,7 @@
   <w:style w:type="table" w:styleId="79">
     <w:name w:val="Medium List 2 Accent 3"/>
     <w:basedOn w:val="32"/>
+    <w:qFormat/>
     <w:uiPriority w:val="66"/>
     <w:pPr>
       <w:spacing w:after="0" w:line="240" w:lineRule="auto"/>
@@ -8568,6 +8648,7 @@
   <w:style w:type="table" w:styleId="80">
     <w:name w:val="Medium List 2 Accent 4"/>
     <w:basedOn w:val="32"/>
+    <w:qFormat/>
     <w:uiPriority w:val="66"/>
     <w:pPr>
       <w:spacing w:after="0" w:line="240" w:lineRule="auto"/>
@@ -8697,6 +8778,7 @@
   <w:style w:type="table" w:styleId="81">
     <w:name w:val="Medium List 2 Accent 5"/>
     <w:basedOn w:val="32"/>
+    <w:qFormat/>
     <w:uiPriority w:val="66"/>
     <w:pPr>
       <w:spacing w:after="0" w:line="240" w:lineRule="auto"/>
@@ -8826,6 +8908,7 @@
   <w:style w:type="table" w:styleId="82">
     <w:name w:val="Medium List 2 Accent 6"/>
     <w:basedOn w:val="32"/>
+    <w:qFormat/>
     <w:uiPriority w:val="66"/>
     <w:pPr>
       <w:spacing w:after="0" w:line="240" w:lineRule="auto"/>
@@ -8955,6 +9038,7 @@
   <w:style w:type="table" w:styleId="83">
     <w:name w:val="Medium Grid 1"/>
     <w:basedOn w:val="32"/>
+    <w:qFormat/>
     <w:uiPriority w:val="67"/>
     <w:pPr>
       <w:spacing w:after="0" w:line="240" w:lineRule="auto"/>
@@ -9024,6 +9108,7 @@
   <w:style w:type="table" w:styleId="84">
     <w:name w:val="Medium Grid 1 Accent 1"/>
     <w:basedOn w:val="32"/>
+    <w:qFormat/>
     <w:uiPriority w:val="67"/>
     <w:pPr>
       <w:spacing w:after="0" w:line="240" w:lineRule="auto"/>
@@ -9093,6 +9178,7 @@
   <w:style w:type="table" w:styleId="85">
     <w:name w:val="Medium Grid 1 Accent 2"/>
     <w:basedOn w:val="32"/>
+    <w:qFormat/>
     <w:uiPriority w:val="67"/>
     <w:pPr>
       <w:spacing w:after="0" w:line="240" w:lineRule="auto"/>
@@ -9162,6 +9248,7 @@
   <w:style w:type="table" w:styleId="86">
     <w:name w:val="Medium Grid 1 Accent 3"/>
     <w:basedOn w:val="32"/>
+    <w:qFormat/>
     <w:uiPriority w:val="67"/>
     <w:pPr>
       <w:spacing w:after="0" w:line="240" w:lineRule="auto"/>
@@ -9231,6 +9318,7 @@
   <w:style w:type="table" w:styleId="87">
     <w:name w:val="Medium Grid 1 Accent 4"/>
     <w:basedOn w:val="32"/>
+    <w:qFormat/>
     <w:uiPriority w:val="67"/>
     <w:pPr>
       <w:spacing w:after="0" w:line="240" w:lineRule="auto"/>
@@ -9300,6 +9388,7 @@
   <w:style w:type="table" w:styleId="88">
     <w:name w:val="Medium Grid 1 Accent 5"/>
     <w:basedOn w:val="32"/>
+    <w:qFormat/>
     <w:uiPriority w:val="67"/>
     <w:pPr>
       <w:spacing w:after="0" w:line="240" w:lineRule="auto"/>
@@ -9369,6 +9458,7 @@
   <w:style w:type="table" w:styleId="89">
     <w:name w:val="Medium Grid 1 Accent 6"/>
     <w:basedOn w:val="32"/>
+    <w:qFormat/>
     <w:uiPriority w:val="67"/>
     <w:pPr>
       <w:spacing w:after="0" w:line="240" w:lineRule="auto"/>
@@ -9438,6 +9528,7 @@
   <w:style w:type="table" w:styleId="90">
     <w:name w:val="Medium Grid 2"/>
     <w:basedOn w:val="32"/>
+    <w:qFormat/>
     <w:uiPriority w:val="68"/>
     <w:pPr>
       <w:spacing w:after="0" w:line="240" w:lineRule="auto"/>
@@ -9584,6 +9675,7 @@
   <w:style w:type="table" w:styleId="91">
     <w:name w:val="Medium Grid 2 Accent 1"/>
     <w:basedOn w:val="32"/>
+    <w:qFormat/>
     <w:uiPriority w:val="68"/>
     <w:pPr>
       <w:spacing w:after="0" w:line="240" w:lineRule="auto"/>
@@ -9730,6 +9822,7 @@
   <w:style w:type="table" w:styleId="92">
     <w:name w:val="Medium Grid 2 Accent 2"/>
     <w:basedOn w:val="32"/>
+    <w:qFormat/>
     <w:uiPriority w:val="68"/>
     <w:pPr>
       <w:spacing w:after="0" w:line="240" w:lineRule="auto"/>
@@ -9876,6 +9969,7 @@
   <w:style w:type="table" w:styleId="93">
     <w:name w:val="Medium Grid 2 Accent 3"/>
     <w:basedOn w:val="32"/>
+    <w:qFormat/>
     <w:uiPriority w:val="68"/>
     <w:pPr>
       <w:spacing w:after="0" w:line="240" w:lineRule="auto"/>
@@ -10022,6 +10116,7 @@
   <w:style w:type="table" w:styleId="94">
     <w:name w:val="Medium Grid 2 Accent 4"/>
     <w:basedOn w:val="32"/>
+    <w:qFormat/>
     <w:uiPriority w:val="68"/>
     <w:pPr>
       <w:spacing w:after="0" w:line="240" w:lineRule="auto"/>
@@ -10168,6 +10263,7 @@
   <w:style w:type="table" w:styleId="95">
     <w:name w:val="Medium Grid 2 Accent 5"/>
     <w:basedOn w:val="32"/>
+    <w:qFormat/>
     <w:uiPriority w:val="68"/>
     <w:pPr>
       <w:spacing w:after="0" w:line="240" w:lineRule="auto"/>
@@ -10314,6 +10410,7 @@
   <w:style w:type="table" w:styleId="96">
     <w:name w:val="Medium Grid 2 Accent 6"/>
     <w:basedOn w:val="32"/>
+    <w:qFormat/>
     <w:uiPriority w:val="68"/>
     <w:pPr>
       <w:spacing w:after="0" w:line="240" w:lineRule="auto"/>
@@ -10460,6 +10557,7 @@
   <w:style w:type="table" w:styleId="97">
     <w:name w:val="Medium Grid 3"/>
     <w:basedOn w:val="32"/>
+    <w:qFormat/>
     <w:uiPriority w:val="69"/>
     <w:pPr>
       <w:spacing w:after="0" w:line="240" w:lineRule="auto"/>
@@ -10617,6 +10715,7 @@
   <w:style w:type="table" w:styleId="98">
     <w:name w:val="Medium Grid 3 Accent 1"/>
     <w:basedOn w:val="32"/>
+    <w:qFormat/>
     <w:uiPriority w:val="69"/>
     <w:pPr>
       <w:spacing w:after="0" w:line="240" w:lineRule="auto"/>
@@ -10774,6 +10873,7 @@
   <w:style w:type="table" w:styleId="99">
     <w:name w:val="Medium Grid 3 Accent 2"/>
     <w:basedOn w:val="32"/>
+    <w:qFormat/>
     <w:uiPriority w:val="69"/>
     <w:pPr>
       <w:spacing w:after="0" w:line="240" w:lineRule="auto"/>
@@ -10931,6 +11031,7 @@
   <w:style w:type="table" w:styleId="100">
     <w:name w:val="Medium Grid 3 Accent 3"/>
     <w:basedOn w:val="32"/>
+    <w:qFormat/>
     <w:uiPriority w:val="69"/>
     <w:pPr>
       <w:spacing w:after="0" w:line="240" w:lineRule="auto"/>
@@ -11088,6 +11189,7 @@
   <w:style w:type="table" w:styleId="101">
     <w:name w:val="Medium Grid 3 Accent 4"/>
     <w:basedOn w:val="32"/>
+    <w:qFormat/>
     <w:uiPriority w:val="69"/>
     <w:pPr>
       <w:spacing w:after="0" w:line="240" w:lineRule="auto"/>
@@ -12134,6 +12236,7 @@
   <w:style w:type="table" w:styleId="109">
     <w:name w:val="Dark List Accent 5"/>
     <w:basedOn w:val="32"/>
+    <w:qFormat/>
     <w:uiPriority w:val="70"/>
     <w:pPr>
       <w:spacing w:after="0" w:line="240" w:lineRule="auto"/>
@@ -13232,6 +13335,7 @@
   <w:style w:type="table" w:styleId="117">
     <w:name w:val="Colorful Shading Accent 6"/>
     <w:basedOn w:val="32"/>
+    <w:qFormat/>
     <w:uiPriority w:val="71"/>
     <w:pPr>
       <w:spacing w:after="0" w:line="240" w:lineRule="auto"/>
@@ -13840,6 +13944,7 @@
   <w:style w:type="table" w:styleId="123">
     <w:name w:val="Colorful List Accent 5"/>
     <w:basedOn w:val="32"/>
+    <w:qFormat/>
     <w:uiPriority w:val="72"/>
     <w:pPr>
       <w:spacing w:after="0" w:line="240" w:lineRule="auto"/>
@@ -14024,6 +14129,7 @@
   <w:style w:type="table" w:styleId="125">
     <w:name w:val="Colorful Grid"/>
     <w:basedOn w:val="32"/>
+    <w:qFormat/>
     <w:uiPriority w:val="73"/>
     <w:pPr>
       <w:spacing w:after="0" w:line="240" w:lineRule="auto"/>
@@ -14717,12 +14823,14 @@
     <w:name w:val="Header Char"/>
     <w:basedOn w:val="132"/>
     <w:link w:val="25"/>
+    <w:qFormat/>
     <w:uiPriority w:val="99"/>
   </w:style>
   <w:style w:type="character" w:customStyle="1" w:styleId="136">
     <w:name w:val="Footer Char"/>
     <w:basedOn w:val="132"/>
     <w:link w:val="24"/>
+    <w:qFormat/>
     <w:uiPriority w:val="99"/>
   </w:style>
   <w:style w:type="paragraph" w:styleId="137">
@@ -14743,6 +14851,7 @@
     <w:name w:val="Heading 1 Char"/>
     <w:basedOn w:val="132"/>
     <w:link w:val="3"/>
+    <w:qFormat/>
     <w:uiPriority w:val="9"/>
     <w:rPr>
       <w:rFonts w:asciiTheme="majorHAnsi" w:hAnsiTheme="majorHAnsi" w:eastAsiaTheme="majorEastAsia" w:cstheme="majorBidi"/>
@@ -14777,6 +14886,7 @@
     <w:name w:val="Heading 3 Char"/>
     <w:basedOn w:val="132"/>
     <w:link w:val="5"/>
+    <w:qFormat/>
     <w:uiPriority w:val="9"/>
     <w:rPr>
       <w:rFonts w:asciiTheme="majorHAnsi" w:hAnsiTheme="majorHAnsi" w:eastAsiaTheme="majorEastAsia" w:cstheme="majorBidi"/>
@@ -14794,6 +14904,7 @@
     <w:name w:val="Title Char"/>
     <w:basedOn w:val="132"/>
     <w:link w:val="31"/>
+    <w:qFormat/>
     <w:uiPriority w:val="10"/>
     <w:rPr>
       <w:rFonts w:asciiTheme="majorHAnsi" w:hAnsiTheme="majorHAnsi" w:eastAsiaTheme="majorEastAsia" w:cstheme="majorBidi"/>

</xml_diff>